<commit_message>
docs: consolidate docs into DOCS.md; archive old md files; remove duplicate crossover script; update paper references and script ordering
</commit_message>
<xml_diff>
--- a/output/tables/Table3_Crossover.docx
+++ b/output/tables/Table3_Crossover.docx
@@ -30,7 +30,7 @@
         <w:gridCol w:w="2234"/>
         <w:gridCol w:w="1734"/>
         <w:gridCol w:w="1544"/>
-        <w:gridCol w:w="1534"/>
+        <w:gridCol w:w="3314"/>
         <w:gridCol w:w="1522"/>
       </w:tblGrid>
       <w:tr>
@@ -405,7 +405,7 @@
                 <w:szCs w:val="20"/>
                 <w:color w:val="000000"/>
               </w:rPr>
-              <w:t xml:space="preserve">0.07568267</w:t>
+              <w:t xml:space="preserve">0.07594026</w:t>
             </w:r>
           </w:p>
         </w:tc>
@@ -457,7 +457,7 @@
                 <w:szCs w:val="20"/>
                 <w:color w:val="000000"/>
               </w:rPr>
-              <w:t xml:space="preserve">0.05788306</w:t>
+              <w:t xml:space="preserve">0.05821164</w:t>
             </w:r>
           </w:p>
         </w:tc>
@@ -509,7 +509,7 @@
                 <w:szCs w:val="20"/>
                 <w:color w:val="000000"/>
               </w:rPr>
-              <w:t xml:space="preserve">-0.01779962</w:t>
+              <w:t xml:space="preserve">-0.017728621775559436080094</w:t>
             </w:r>
           </w:p>
         </w:tc>
@@ -561,7 +561,7 @@
                 <w:szCs w:val="20"/>
                 <w:color w:val="000000"/>
               </w:rPr>
-              <w:t xml:space="preserve">-23.5</w:t>
+              <w:t xml:space="preserve">-23.3</w:t>
             </w:r>
           </w:p>
         </w:tc>
@@ -619,7 +619,7 @@
                 <w:szCs w:val="20"/>
                 <w:color w:val="000000"/>
               </w:rPr>
-              <w:t xml:space="preserve">Crossover ($14,159)</w:t>
+              <w:t xml:space="preserve">Crossover ($14,125)</w:t>
             </w:r>
           </w:p>
         </w:tc>
@@ -671,7 +671,7 @@
                 <w:szCs w:val="20"/>
                 <w:color w:val="000000"/>
               </w:rPr>
-              <w:t xml:space="preserve">0.04814835</w:t>
+              <w:t xml:space="preserve">0.04837842</w:t>
             </w:r>
           </w:p>
         </w:tc>
@@ -723,7 +723,7 @@
                 <w:szCs w:val="20"/>
                 <w:color w:val="000000"/>
               </w:rPr>
-              <w:t xml:space="preserve">0.04814835</w:t>
+              <w:t xml:space="preserve">0.04837842</w:t>
             </w:r>
           </w:p>
         </w:tc>
@@ -775,7 +775,7 @@
                 <w:szCs w:val="20"/>
                 <w:color w:val="000000"/>
               </w:rPr>
-              <w:t xml:space="preserve">0.00000000</w:t>
+              <w:t xml:space="preserve">0.000000000000000006938894</w:t>
             </w:r>
           </w:p>
         </w:tc>
@@ -937,7 +937,7 @@
                 <w:szCs w:val="20"/>
                 <w:color w:val="000000"/>
               </w:rPr>
-              <w:t xml:space="preserve">0.02067767</w:t>
+              <w:t xml:space="preserve">0.02075202</w:t>
             </w:r>
           </w:p>
         </w:tc>
@@ -989,7 +989,7 @@
                 <w:szCs w:val="20"/>
                 <w:color w:val="000000"/>
               </w:rPr>
-              <w:t xml:space="preserve">0.03843614</w:t>
+              <w:t xml:space="preserve">0.03852217</w:t>
             </w:r>
           </w:p>
         </w:tc>
@@ -1041,7 +1041,7 @@
                 <w:szCs w:val="20"/>
                 <w:color w:val="000000"/>
               </w:rPr>
-              <w:t xml:space="preserve">0.01775847</w:t>
+              <w:t xml:space="preserve">0.017770150147484908148554</w:t>
             </w:r>
           </w:p>
         </w:tc>
@@ -1093,7 +1093,7 @@
                 <w:szCs w:val="20"/>
                 <w:color w:val="000000"/>
               </w:rPr>
-              <w:t xml:space="preserve">85.9</w:t>
+              <w:t xml:space="preserve">85.6</w:t>
             </w:r>
           </w:p>
         </w:tc>
@@ -1152,7 +1152,7 @@
                 <w:szCs w:val="22"/>
                 <w:color w:val="000000"/>
               </w:rPr>
-              <w:t xml:space="preserve">Predicted values from Interaction Model (Table 1). Robust SEs in parentheses. Reference category: Parliamentary systems.</w:t>
+              <w:t xml:space="preserve">Predicted values from Interaction Model. Reference: Parliamentary systems.</w:t>
             </w:r>
           </w:p>
         </w:tc>

</xml_diff>